<commit_message>
Site updated: 2026-08-30 17:31:05
</commit_message>
<xml_diff>
--- a/downloads/downloads/关于校门口不规范摆摊的提案-第2版.docx
+++ b/downloads/downloads/关于校门口不规范摆摊的提案-第2版.docx
@@ -21,6 +21,8 @@
         </w:rPr>
         <w:t>青少年模拟政协提案征集活动提案作品表</w:t>
       </w:r>
+      <w:bookmarkStart w:id="0" w:name="_GoBack"/>
+      <w:bookmarkEnd w:id="0"/>
     </w:p>
     <w:tbl>
       <w:tblPr>
@@ -151,13 +153,23 @@
             <w:pPr>
               <w:jc w:val="left"/>
               <w:rPr>
-                <w:rFonts w:hint="eastAsia" w:ascii="方正公文小标宋" w:hAnsi="方正公文小标宋" w:eastAsia="方正公文小标宋" w:cs="方正公文小标宋"/>
-                <w:sz w:val="32"/>
-                <w:szCs w:val="32"/>
-                <w:vertAlign w:val="baseline"/>
-                <w:lang w:val="en-US" w:eastAsia="zh-CN"/>
-              </w:rPr>
-            </w:pPr>
+                <w:rFonts w:hint="default" w:ascii="方正公文小标宋" w:hAnsi="方正公文小标宋" w:eastAsia="方正公文小标宋" w:cs="方正公文小标宋"/>
+                <w:sz w:val="32"/>
+                <w:szCs w:val="32"/>
+                <w:vertAlign w:val="baseline"/>
+                <w:lang w:val="en-US" w:eastAsia="zh-CN"/>
+              </w:rPr>
+            </w:pPr>
+            <w:r>
+              <w:rPr>
+                <w:rFonts w:hint="eastAsia" w:ascii="仿宋" w:hAnsi="仿宋" w:eastAsia="仿宋" w:cs="仿宋"/>
+                <w:sz w:val="32"/>
+                <w:szCs w:val="32"/>
+                <w:vertAlign w:val="baseline"/>
+                <w:lang w:val="en-US" w:eastAsia="zh-CN"/>
+              </w:rPr>
+              <w:t>何祥烁、王予承</w:t>
+            </w:r>
           </w:p>
         </w:tc>
       </w:tr>
@@ -265,13 +277,23 @@
             <w:pPr>
               <w:jc w:val="left"/>
               <w:rPr>
-                <w:rFonts w:hint="eastAsia" w:ascii="方正公文小标宋" w:hAnsi="方正公文小标宋" w:eastAsia="方正公文小标宋" w:cs="方正公文小标宋"/>
-                <w:sz w:val="32"/>
-                <w:szCs w:val="32"/>
-                <w:vertAlign w:val="baseline"/>
-                <w:lang w:val="en-US" w:eastAsia="zh-CN"/>
-              </w:rPr>
-            </w:pPr>
+                <w:rFonts w:hint="default" w:ascii="方正公文小标宋" w:hAnsi="方正公文小标宋" w:eastAsia="方正公文小标宋" w:cs="方正公文小标宋"/>
+                <w:sz w:val="32"/>
+                <w:szCs w:val="32"/>
+                <w:vertAlign w:val="baseline"/>
+                <w:lang w:val="en-US" w:eastAsia="zh-CN"/>
+              </w:rPr>
+            </w:pPr>
+            <w:r>
+              <w:rPr>
+                <w:rFonts w:hint="eastAsia" w:ascii="仿宋" w:hAnsi="仿宋" w:eastAsia="仿宋" w:cs="仿宋"/>
+                <w:sz w:val="32"/>
+                <w:szCs w:val="32"/>
+                <w:vertAlign w:val="baseline"/>
+                <w:lang w:val="en-US" w:eastAsia="zh-CN"/>
+              </w:rPr>
+              <w:t>郭思琦老师</w:t>
+            </w:r>
           </w:p>
         </w:tc>
       </w:tr>
@@ -339,17 +361,7 @@
                 <w:sz w:val="36"/>
                 <w:szCs w:val="36"/>
               </w:rPr>
-              <w:t>关于</w:t>
-            </w:r>
-            <w:bookmarkStart w:id="0" w:name="_GoBack"/>
-            <w:bookmarkEnd w:id="0"/>
-            <w:r>
-              <w:rPr>
-                <w:rFonts w:hint="eastAsia" w:ascii="方正小标宋简体" w:hAnsi="方正小标宋简体" w:eastAsia="方正小标宋简体"/>
-                <w:sz w:val="36"/>
-                <w:szCs w:val="36"/>
-              </w:rPr>
-              <w:t>校门口不规范摆摊的提案</w:t>
+              <w:t>关于校门口不规范摆摊的提案</w:t>
             </w:r>
           </w:p>
         </w:tc>

</xml_diff>